<commit_message>
Minor Updates to Class and Fragen
</commit_message>
<xml_diff>
--- a/Documents/Fragen.docx
+++ b/Documents/Fragen.docx
@@ -9,60 +9,92 @@
           <w:lang w:val="en-GB"/>
         </w:rPr>
       </w:pPr>
-      <w:proofErr w:type="spellStart"/>
       <w:r>
         <w:rPr>
           <w:lang w:val="en-GB"/>
         </w:rPr>
-        <w:t>Aufsetzen</w:t>
-      </w:r>
-      <w:proofErr w:type="spellEnd"/>
-      <w:r>
+        <w:t>Aufsetzen der VM</w:t>
+      </w:r>
+    </w:p>
+    <w:p>
+      <w:pPr>
         <w:rPr>
           <w:lang w:val="en-GB"/>
         </w:rPr>
-        <w:t xml:space="preserve"> der VM</w:t>
-      </w:r>
-    </w:p>
-    <w:p>
-      <w:pPr>
+      </w:pPr>
+      <w:r>
         <w:rPr>
           <w:lang w:val="en-GB"/>
         </w:rPr>
-      </w:pPr>
-      <w:r>
+        <w:t>python -m venv .venv</w:t>
+      </w:r>
+    </w:p>
+    <w:p>
+      <w:pPr>
         <w:rPr>
           <w:lang w:val="en-GB"/>
         </w:rPr>
-        <w:t xml:space="preserve">python -m </w:t>
-      </w:r>
-      <w:proofErr w:type="spellStart"/>
-      <w:proofErr w:type="gramStart"/>
+      </w:pPr>
       <w:r>
         <w:rPr>
           <w:lang w:val="en-GB"/>
         </w:rPr>
-        <w:t>venv</w:t>
-      </w:r>
-      <w:proofErr w:type="spellEnd"/>
-      <w:r>
+        <w:t>.venv\Scripts\Activate.ps1</w:t>
+      </w:r>
+    </w:p>
+    <w:p>
+      <w:pPr>
+        <w:rPr>
+          <w:lang w:val="de-CH"/>
+        </w:rPr>
+      </w:pPr>
+      <w:r>
+        <w:rPr>
+          <w:lang w:val="de-CH"/>
+        </w:rPr>
+        <w:t>Falls ein zugriffserror auftaucht powersehll als Admin öffnen und diesen Comand eingeben, diesen Command dann wieder</w:t>
+      </w:r>
+      <w:r>
+        <w:rPr>
+          <w:lang w:val="de-CH"/>
+        </w:rPr>
+        <w:t xml:space="preserve"> mit n zurücksetzen damit scripts nicht mehr ausgeführt werden können</w:t>
+      </w:r>
+      <w:r>
+        <w:rPr>
+          <w:lang w:val="de-CH"/>
+        </w:rPr>
+        <w:t>:</w:t>
+      </w:r>
+      <w:r>
+        <w:rPr>
+          <w:lang w:val="de-CH"/>
+        </w:rPr>
+        <w:br/>
+      </w:r>
+      <w:r>
+        <w:rPr>
+          <w:lang w:val="de-CH"/>
+        </w:rPr>
+        <w:t>Set-ExecutionPolicy -ExecutionPolicy RemoteSigned -Scope CurrentUser</w:t>
+      </w:r>
+    </w:p>
+    <w:p>
+      <w:pPr>
         <w:rPr>
           <w:lang w:val="en-GB"/>
         </w:rPr>
-        <w:t xml:space="preserve"> .</w:t>
-      </w:r>
-      <w:proofErr w:type="spellStart"/>
+      </w:pPr>
       <w:r>
         <w:rPr>
           <w:lang w:val="en-GB"/>
         </w:rPr>
-        <w:t>venv</w:t>
-      </w:r>
-      <w:proofErr w:type="spellEnd"/>
-      <w:proofErr w:type="gramEnd"/>
-    </w:p>
-    <w:p>
-      <w:pPr>
+        <w:t>pip install -r requirements.txt</w:t>
+      </w:r>
+    </w:p>
+    <w:p>
+      <w:pPr>
+        <w:pStyle w:val="Title"/>
         <w:rPr>
           <w:lang w:val="en-GB"/>
         </w:rPr>
@@ -71,215 +103,412 @@
         <w:rPr>
           <w:lang w:val="en-GB"/>
         </w:rPr>
-        <w:t>.</w:t>
-      </w:r>
-      <w:proofErr w:type="spellStart"/>
-      <w:r>
+        <w:t>Fragen</w:t>
+      </w:r>
+    </w:p>
+    <w:p>
+      <w:pPr>
         <w:rPr>
           <w:lang w:val="en-GB"/>
         </w:rPr>
-        <w:t>venv</w:t>
-      </w:r>
-      <w:proofErr w:type="spellEnd"/>
-      <w:r>
-        <w:rPr>
-          <w:lang w:val="en-GB"/>
-        </w:rPr>
-        <w:t>\Scripts\Activate.ps1</w:t>
-      </w:r>
-    </w:p>
-    <w:p>
-      <w:pPr>
-        <w:rPr>
-          <w:lang w:val="de-CH"/>
-        </w:rPr>
-      </w:pPr>
-      <w:r>
-        <w:rPr>
-          <w:lang w:val="de-CH"/>
-        </w:rPr>
-        <w:t xml:space="preserve">Falls ein </w:t>
-      </w:r>
-      <w:proofErr w:type="spellStart"/>
-      <w:r>
-        <w:rPr>
-          <w:lang w:val="de-CH"/>
-        </w:rPr>
-        <w:t>zugriffserror</w:t>
-      </w:r>
-      <w:proofErr w:type="spellEnd"/>
-      <w:r>
-        <w:rPr>
-          <w:lang w:val="de-CH"/>
-        </w:rPr>
-        <w:t xml:space="preserve"> auftaucht </w:t>
-      </w:r>
-      <w:proofErr w:type="spellStart"/>
-      <w:r>
-        <w:rPr>
-          <w:lang w:val="de-CH"/>
-        </w:rPr>
-        <w:t>powersehll</w:t>
-      </w:r>
-      <w:proofErr w:type="spellEnd"/>
-      <w:r>
-        <w:rPr>
-          <w:lang w:val="de-CH"/>
-        </w:rPr>
-        <w:t xml:space="preserve"> als Admin öffnen und diesen </w:t>
-      </w:r>
-      <w:proofErr w:type="spellStart"/>
-      <w:r>
-        <w:rPr>
-          <w:lang w:val="de-CH"/>
-        </w:rPr>
-        <w:t>Comand</w:t>
-      </w:r>
-      <w:proofErr w:type="spellEnd"/>
-      <w:r>
-        <w:rPr>
-          <w:lang w:val="de-CH"/>
-        </w:rPr>
-        <w:t xml:space="preserve"> eingeben, diesen Command dann wieder</w:t>
-      </w:r>
-      <w:r>
-        <w:rPr>
-          <w:lang w:val="de-CH"/>
-        </w:rPr>
-        <w:t xml:space="preserve"> mit n zurücksetzen damit </w:t>
-      </w:r>
-      <w:proofErr w:type="spellStart"/>
-      <w:r>
-        <w:rPr>
-          <w:lang w:val="de-CH"/>
-        </w:rPr>
-        <w:t>scripts</w:t>
-      </w:r>
-      <w:proofErr w:type="spellEnd"/>
-      <w:r>
-        <w:rPr>
-          <w:lang w:val="de-CH"/>
-        </w:rPr>
-        <w:t xml:space="preserve"> nicht mehr ausgeführt werden können</w:t>
-      </w:r>
-      <w:r>
-        <w:rPr>
-          <w:lang w:val="de-CH"/>
-        </w:rPr>
-        <w:t>:</w:t>
-      </w:r>
-      <w:r>
-        <w:rPr>
-          <w:lang w:val="de-CH"/>
+      </w:pPr>
+    </w:p>
+    <w:p>
+      <w:pPr>
+        <w:pStyle w:val="ListParagraph"/>
+        <w:numPr>
+          <w:ilvl w:val="0"/>
+          <w:numId w:val="1"/>
+        </w:numPr>
+        <w:rPr>
+          <w:lang w:val="de-DE"/>
+        </w:rPr>
+      </w:pPr>
+      <w:r>
+        <w:rPr>
+          <w:lang w:val="de-DE"/>
+        </w:rPr>
+        <w:t>Müssen die Patterns 3D erkannt w</w:t>
+      </w:r>
+      <w:r>
+        <w:rPr>
+          <w:lang w:val="de-DE"/>
+        </w:rPr>
+        <w:t>erden oder sind die Patterns 2D auf Papieren?</w:t>
+      </w:r>
+    </w:p>
+    <w:p>
+      <w:pPr>
+        <w:pStyle w:val="ListParagraph"/>
+        <w:numPr>
+          <w:ilvl w:val="1"/>
+          <w:numId w:val="1"/>
+        </w:numPr>
+        <w:rPr>
+          <w:lang w:val="de-DE"/>
+        </w:rPr>
+      </w:pPr>
+      <w:r>
+        <w:rPr>
+          <w:lang w:val="de-DE"/>
+        </w:rPr>
+        <w:t>2D</w:t>
+      </w:r>
+    </w:p>
+    <w:p>
+      <w:pPr>
+        <w:pStyle w:val="ListParagraph"/>
+        <w:numPr>
+          <w:ilvl w:val="0"/>
+          <w:numId w:val="1"/>
+        </w:numPr>
+        <w:rPr>
+          <w:lang w:val="de-DE"/>
+        </w:rPr>
+      </w:pPr>
+      <w:r>
+        <w:rPr>
+          <w:lang w:val="de-DE"/>
+        </w:rPr>
+        <w:t>Reichen folgende Patterns: circle, rectangle,</w:t>
+      </w:r>
+      <w:r>
+        <w:rPr>
+          <w:lang w:val="de-DE"/>
+        </w:rPr>
+        <w:t xml:space="preserve"> </w:t>
+      </w:r>
+      <w:r>
+        <w:rPr>
+          <w:lang w:val="de-DE"/>
+        </w:rPr>
+        <w:t>square, triangle</w:t>
+      </w:r>
+      <w:r>
+        <w:rPr>
+          <w:lang w:val="de-DE"/>
+        </w:rPr>
+        <w:t xml:space="preserve"> oder werden mehr benötigt</w:t>
+      </w:r>
+    </w:p>
+    <w:p>
+      <w:pPr>
+        <w:pStyle w:val="ListParagraph"/>
+        <w:numPr>
+          <w:ilvl w:val="1"/>
+          <w:numId w:val="1"/>
+        </w:numPr>
+        <w:rPr>
+          <w:lang w:val="de-DE"/>
+        </w:rPr>
+      </w:pPr>
+      <w:r>
+        <w:rPr>
+          <w:lang w:val="de-DE"/>
+        </w:rPr>
+        <w:t>Reicht, einfach neue Patterns hinzufügen könen</w:t>
+      </w:r>
+    </w:p>
+    <w:p>
+      <w:pPr>
+        <w:pStyle w:val="ListParagraph"/>
+        <w:numPr>
+          <w:ilvl w:val="0"/>
+          <w:numId w:val="1"/>
+        </w:numPr>
+        <w:rPr>
+          <w:lang w:val="de-DE"/>
+        </w:rPr>
+      </w:pPr>
+      <w:r>
+        <w:rPr>
+          <w:lang w:val="de-DE"/>
+        </w:rPr>
+        <w:t xml:space="preserve">Reichen folgende Farben: </w:t>
+      </w:r>
+      <w:r>
+        <w:rPr>
+          <w:lang w:val="de-DE"/>
+        </w:rPr>
+        <w:t>red, green, blue, yellow, violet</w:t>
+      </w:r>
+    </w:p>
+    <w:p>
+      <w:pPr>
+        <w:pStyle w:val="ListParagraph"/>
+        <w:numPr>
+          <w:ilvl w:val="1"/>
+          <w:numId w:val="1"/>
+        </w:numPr>
+        <w:rPr>
+          <w:lang w:val="de-DE"/>
+        </w:rPr>
+      </w:pPr>
+      <w:r>
+        <w:rPr>
+          <w:lang w:val="de-DE"/>
+        </w:rPr>
+        <w:t>Reicht</w:t>
+      </w:r>
+    </w:p>
+    <w:p>
+      <w:pPr>
+        <w:pStyle w:val="ListParagraph"/>
+        <w:numPr>
+          <w:ilvl w:val="0"/>
+          <w:numId w:val="1"/>
+        </w:numPr>
+        <w:rPr>
+          <w:lang w:val="de-DE"/>
+        </w:rPr>
+      </w:pPr>
+      <w:r>
+        <w:rPr>
+          <w:lang w:val="de-DE"/>
+        </w:rPr>
+        <w:t xml:space="preserve">Gutes Tool / zur Dokumentation von </w:t>
+      </w:r>
+      <w:r>
+        <w:rPr>
+          <w:lang w:val="de-DE"/>
+        </w:rPr>
+        <w:t>static und runtime view Diagrams, vor allem für UML class Diagramms, runtime view Diagrams = Flussidagram?</w:t>
+      </w:r>
+    </w:p>
+    <w:p>
+      <w:pPr>
+        <w:pStyle w:val="ListParagraph"/>
+        <w:numPr>
+          <w:ilvl w:val="1"/>
+          <w:numId w:val="1"/>
+        </w:numPr>
+        <w:rPr>
+          <w:lang w:val="de-DE"/>
+        </w:rPr>
+      </w:pPr>
+      <w:r>
+        <w:rPr>
+          <w:lang w:val="de-DE"/>
+        </w:rPr>
+        <w:t>UML Class Diagramms</w:t>
+      </w:r>
+      <w:r>
+        <w:rPr>
+          <w:lang w:val="de-DE"/>
+        </w:rPr>
+        <w:t xml:space="preserve"> Editor: </w:t>
+      </w:r>
+    </w:p>
+    <w:p>
+      <w:pPr>
+        <w:pStyle w:val="ListParagraph"/>
+        <w:numPr>
+          <w:ilvl w:val="1"/>
+          <w:numId w:val="1"/>
+        </w:numPr>
+        <w:rPr>
+          <w:lang w:val="de-DE"/>
+        </w:rPr>
+      </w:pPr>
+      <w:r>
+        <w:rPr>
+          <w:lang w:val="de-DE"/>
+        </w:rPr>
+        <w:t>Kommt nächste Woche, Mermaid als Editor</w:t>
+      </w:r>
+    </w:p>
+    <w:p>
+      <w:pPr>
+        <w:pStyle w:val="ListParagraph"/>
+        <w:numPr>
+          <w:ilvl w:val="0"/>
+          <w:numId w:val="1"/>
+        </w:numPr>
+        <w:rPr>
+          <w:lang w:val="de-DE"/>
+        </w:rPr>
+      </w:pPr>
+      <w:r>
+        <w:rPr>
+          <w:lang w:val="de-DE"/>
+        </w:rPr>
+        <w:t>Eher Funktionen oder direkt Klassen verwenden?</w:t>
+      </w:r>
+    </w:p>
+    <w:p>
+      <w:pPr>
+        <w:pStyle w:val="ListParagraph"/>
+        <w:numPr>
+          <w:ilvl w:val="1"/>
+          <w:numId w:val="1"/>
+        </w:numPr>
+        <w:rPr>
+          <w:lang w:val="de-DE"/>
+        </w:rPr>
+      </w:pPr>
+      <w:r>
+        <w:rPr>
+          <w:lang w:val="de-DE"/>
+        </w:rPr>
+        <w:t xml:space="preserve">Klassen verwenden, Kamera Komponente, </w:t>
+      </w:r>
+    </w:p>
+    <w:p>
+      <w:pPr>
+        <w:pStyle w:val="ListParagraph"/>
+        <w:numPr>
+          <w:ilvl w:val="0"/>
+          <w:numId w:val="1"/>
+        </w:numPr>
+        <w:rPr>
+          <w:lang w:val="de-DE"/>
+        </w:rPr>
+      </w:pPr>
+      <w:r>
+        <w:rPr>
+          <w:lang w:val="de-DE"/>
+        </w:rPr>
+        <w:t>Reicht es für die Beiden operationsmodis, das diese über die Komando Zeile ausgewählt werden können?</w:t>
+      </w:r>
+    </w:p>
+    <w:p>
+      <w:pPr>
+        <w:pStyle w:val="ListParagraph"/>
+        <w:numPr>
+          <w:ilvl w:val="1"/>
+          <w:numId w:val="1"/>
+        </w:numPr>
+        <w:rPr>
+          <w:lang w:val="de-DE"/>
+        </w:rPr>
+      </w:pPr>
+      <w:r>
+        <w:rPr>
+          <w:lang w:val="de-DE"/>
+        </w:rPr>
+        <w:t>Solange das Dokumentier ist. Sauber dokumentieren wie starten</w:t>
+      </w:r>
+    </w:p>
+    <w:p>
+      <w:pPr>
+        <w:pStyle w:val="ListParagraph"/>
+        <w:numPr>
+          <w:ilvl w:val="0"/>
+          <w:numId w:val="1"/>
+        </w:numPr>
+        <w:rPr>
+          <w:lang w:val="de-DE"/>
+        </w:rPr>
+      </w:pPr>
+      <w:r>
+        <w:rPr>
+          <w:lang w:val="de-DE"/>
+        </w:rPr>
+        <w:t>Pfad zu Bilder für IMAGE Mode auch im config file speichern?</w:t>
+      </w:r>
+    </w:p>
+    <w:p>
+      <w:pPr>
+        <w:pStyle w:val="ListParagraph"/>
+        <w:numPr>
+          <w:ilvl w:val="1"/>
+          <w:numId w:val="1"/>
+        </w:numPr>
+        <w:rPr>
+          <w:lang w:val="de-DE"/>
+        </w:rPr>
+      </w:pPr>
+      <w:r>
+        <w:rPr>
+          <w:lang w:val="de-DE"/>
+        </w:rPr>
+        <w:t>Ins Config File schreiben</w:t>
+      </w:r>
+    </w:p>
+    <w:p>
+      <w:pPr>
+        <w:pStyle w:val="ListParagraph"/>
+        <w:numPr>
+          <w:ilvl w:val="0"/>
+          <w:numId w:val="1"/>
+        </w:numPr>
+        <w:rPr>
+          <w:lang w:val="de-DE"/>
+        </w:rPr>
+      </w:pPr>
+      <w:r>
+        <w:rPr>
+          <w:lang w:val="de-DE"/>
+        </w:rPr>
+        <w:t>Flowcharts in md Readme wird noch ge</w:t>
+      </w:r>
+      <w:r>
+        <w:rPr>
+          <w:lang w:val="de-DE"/>
+        </w:rPr>
+        <w:t>zeigt?</w:t>
+      </w:r>
+    </w:p>
+    <w:p>
+      <w:pPr>
+        <w:pStyle w:val="ListParagraph"/>
+        <w:numPr>
+          <w:ilvl w:val="1"/>
+          <w:numId w:val="1"/>
+        </w:numPr>
+        <w:rPr>
+          <w:lang w:val="de-DE"/>
+        </w:rPr>
+      </w:pPr>
+      <w:r>
+        <w:rPr>
+          <w:lang w:val="de-DE"/>
+        </w:rPr>
+        <w:t>Wird noch gezeigt</w:t>
+      </w:r>
+    </w:p>
+    <w:p>
+      <w:pPr>
+        <w:pStyle w:val="ListParagraph"/>
+        <w:numPr>
+          <w:ilvl w:val="0"/>
+          <w:numId w:val="1"/>
+        </w:numPr>
+        <w:rPr>
+          <w:lang w:val="de-DE"/>
+        </w:rPr>
+      </w:pPr>
+      <w:r>
+        <w:rPr>
+          <w:lang w:val="de-DE"/>
+        </w:rPr>
+        <w:t>Was sollte das GUI beinhalten?</w:t>
+      </w:r>
+      <w:r>
+        <w:rPr>
+          <w:lang w:val="de-DE"/>
         </w:rPr>
         <w:br/>
-      </w:r>
-      <w:r>
-        <w:rPr>
-          <w:lang w:val="de-CH"/>
-        </w:rPr>
-        <w:t>Set-</w:t>
-      </w:r>
-      <w:proofErr w:type="spellStart"/>
-      <w:r>
-        <w:rPr>
-          <w:lang w:val="de-CH"/>
-        </w:rPr>
-        <w:t>ExecutionPolicy</w:t>
-      </w:r>
-      <w:proofErr w:type="spellEnd"/>
-      <w:r>
-        <w:rPr>
-          <w:lang w:val="de-CH"/>
-        </w:rPr>
-        <w:t xml:space="preserve"> -</w:t>
-      </w:r>
-      <w:proofErr w:type="spellStart"/>
-      <w:r>
-        <w:rPr>
-          <w:lang w:val="de-CH"/>
-        </w:rPr>
-        <w:t>ExecutionPolicy</w:t>
-      </w:r>
-      <w:proofErr w:type="spellEnd"/>
-      <w:r>
-        <w:rPr>
-          <w:lang w:val="de-CH"/>
-        </w:rPr>
-        <w:t xml:space="preserve"> </w:t>
-      </w:r>
-      <w:proofErr w:type="spellStart"/>
-      <w:r>
-        <w:rPr>
-          <w:lang w:val="de-CH"/>
-        </w:rPr>
-        <w:t>RemoteSigned</w:t>
-      </w:r>
-      <w:proofErr w:type="spellEnd"/>
-      <w:r>
-        <w:rPr>
-          <w:lang w:val="de-CH"/>
-        </w:rPr>
-        <w:t xml:space="preserve"> -</w:t>
-      </w:r>
-      <w:proofErr w:type="spellStart"/>
-      <w:r>
-        <w:rPr>
-          <w:lang w:val="de-CH"/>
-        </w:rPr>
-        <w:t>Scope</w:t>
-      </w:r>
-      <w:proofErr w:type="spellEnd"/>
-      <w:r>
-        <w:rPr>
-          <w:lang w:val="de-CH"/>
-        </w:rPr>
-        <w:t xml:space="preserve"> </w:t>
-      </w:r>
-      <w:proofErr w:type="spellStart"/>
-      <w:r>
-        <w:rPr>
-          <w:lang w:val="de-CH"/>
-        </w:rPr>
-        <w:t>CurrentUser</w:t>
-      </w:r>
-      <w:proofErr w:type="spellEnd"/>
-    </w:p>
-    <w:p>
-      <w:pPr>
-        <w:rPr>
-          <w:lang w:val="en-GB"/>
-        </w:rPr>
-      </w:pPr>
-      <w:r>
-        <w:rPr>
-          <w:lang w:val="en-GB"/>
-        </w:rPr>
-        <w:t>pip install -r requirements.txt</w:t>
-      </w:r>
-    </w:p>
-    <w:p>
-      <w:pPr>
-        <w:pStyle w:val="Title"/>
-        <w:rPr>
-          <w:lang w:val="en-GB"/>
-        </w:rPr>
-      </w:pPr>
-      <w:proofErr w:type="spellStart"/>
-      <w:r>
-        <w:rPr>
-          <w:lang w:val="en-GB"/>
-        </w:rPr>
-        <w:t>Fragen</w:t>
-      </w:r>
-      <w:proofErr w:type="spellEnd"/>
-    </w:p>
-    <w:p>
-      <w:pPr>
-        <w:rPr>
-          <w:lang w:val="en-GB"/>
-        </w:rPr>
-      </w:pPr>
+        <w:t>Button zum Wechseln der operation Modis?</w:t>
+      </w:r>
+    </w:p>
+    <w:p>
+      <w:pPr>
+        <w:pStyle w:val="ListParagraph"/>
+        <w:numPr>
+          <w:ilvl w:val="1"/>
+          <w:numId w:val="1"/>
+        </w:numPr>
+        <w:rPr>
+          <w:lang w:val="de-DE"/>
+        </w:rPr>
+      </w:pPr>
+      <w:r>
+        <w:rPr>
+          <w:lang w:val="de-DE"/>
+        </w:rPr>
+        <w:t>Fliessband anlage als Beispiel detection und speichern anzeigen</w:t>
+      </w:r>
     </w:p>
     <w:p>
       <w:pPr>
@@ -296,13 +525,7 @@
         <w:rPr>
           <w:lang w:val="de-DE"/>
         </w:rPr>
-        <w:t>Müssen die Patterns 3D erkannt w</w:t>
-      </w:r>
-      <w:r>
-        <w:rPr>
-          <w:lang w:val="de-DE"/>
-        </w:rPr>
-        <w:t>erden oder sind die Patterns 2D auf Papieren?</w:t>
+        <w:t xml:space="preserve">FEAT ist einfach eine stimme welche sagt, Dreieck Rot, Viereck Gelb, usw. </w:t>
       </w:r>
     </w:p>
     <w:p>
@@ -316,12 +539,6 @@
           <w:lang w:val="de-DE"/>
         </w:rPr>
       </w:pPr>
-      <w:r>
-        <w:rPr>
-          <w:lang w:val="de-DE"/>
-        </w:rPr>
-        <w:t>2D</w:t>
-      </w:r>
     </w:p>
     <w:p>
       <w:pPr>
@@ -338,69 +555,7 @@
         <w:rPr>
           <w:lang w:val="de-DE"/>
         </w:rPr>
-        <w:t xml:space="preserve">Reichen folgende Patterns: </w:t>
-      </w:r>
-      <w:proofErr w:type="spellStart"/>
-      <w:r>
-        <w:rPr>
-          <w:lang w:val="de-DE"/>
-        </w:rPr>
-        <w:t>circle</w:t>
-      </w:r>
-      <w:proofErr w:type="spellEnd"/>
-      <w:r>
-        <w:rPr>
-          <w:lang w:val="de-DE"/>
-        </w:rPr>
-        <w:t xml:space="preserve">, </w:t>
-      </w:r>
-      <w:proofErr w:type="spellStart"/>
-      <w:r>
-        <w:rPr>
-          <w:lang w:val="de-DE"/>
-        </w:rPr>
-        <w:t>rectangle</w:t>
-      </w:r>
-      <w:proofErr w:type="spellEnd"/>
-      <w:r>
-        <w:rPr>
-          <w:lang w:val="de-DE"/>
-        </w:rPr>
-        <w:t>,</w:t>
-      </w:r>
-      <w:r>
-        <w:rPr>
-          <w:lang w:val="de-DE"/>
-        </w:rPr>
-        <w:t xml:space="preserve"> </w:t>
-      </w:r>
-      <w:proofErr w:type="spellStart"/>
-      <w:r>
-        <w:rPr>
-          <w:lang w:val="de-DE"/>
-        </w:rPr>
-        <w:t>square</w:t>
-      </w:r>
-      <w:proofErr w:type="spellEnd"/>
-      <w:r>
-        <w:rPr>
-          <w:lang w:val="de-DE"/>
-        </w:rPr>
-        <w:t xml:space="preserve">, </w:t>
-      </w:r>
-      <w:proofErr w:type="spellStart"/>
-      <w:r>
-        <w:rPr>
-          <w:lang w:val="de-DE"/>
-        </w:rPr>
-        <w:t>triangle</w:t>
-      </w:r>
-      <w:proofErr w:type="spellEnd"/>
-      <w:r>
-        <w:rPr>
-          <w:lang w:val="de-DE"/>
-        </w:rPr>
-        <w:t xml:space="preserve"> oder werden mehr benötigt</w:t>
+        <w:t>Muss FEAT in Dauerschleife laufen oder kann man auf ein Pattern drücken und es gibt dessen Properties aus?</w:t>
       </w:r>
     </w:p>
     <w:p>
@@ -418,16 +573,8 @@
         <w:rPr>
           <w:lang w:val="de-DE"/>
         </w:rPr>
-        <w:t xml:space="preserve">Reicht, einfach neue Patterns hinzufügen </w:t>
-      </w:r>
-      <w:proofErr w:type="spellStart"/>
-      <w:r>
-        <w:rPr>
-          <w:lang w:val="de-DE"/>
-        </w:rPr>
-        <w:t>könen</w:t>
-      </w:r>
-      <w:proofErr w:type="spellEnd"/>
+        <w:t xml:space="preserve">Logs und Autdio output nur 1x Pro Pattern </w:t>
+      </w:r>
     </w:p>
     <w:p>
       <w:pPr>
@@ -444,72 +591,20 @@
         <w:rPr>
           <w:lang w:val="de-DE"/>
         </w:rPr>
-        <w:t xml:space="preserve">Reichen folgende Farben: </w:t>
-      </w:r>
-      <w:proofErr w:type="spellStart"/>
-      <w:r>
-        <w:rPr>
-          <w:lang w:val="de-DE"/>
-        </w:rPr>
-        <w:t>red</w:t>
-      </w:r>
-      <w:proofErr w:type="spellEnd"/>
-      <w:r>
-        <w:rPr>
-          <w:lang w:val="de-DE"/>
-        </w:rPr>
-        <w:t xml:space="preserve">, </w:t>
-      </w:r>
-      <w:proofErr w:type="spellStart"/>
-      <w:r>
-        <w:rPr>
-          <w:lang w:val="de-DE"/>
-        </w:rPr>
-        <w:t>green</w:t>
-      </w:r>
-      <w:proofErr w:type="spellEnd"/>
-      <w:r>
-        <w:rPr>
-          <w:lang w:val="de-DE"/>
-        </w:rPr>
-        <w:t xml:space="preserve">, </w:t>
-      </w:r>
-      <w:proofErr w:type="spellStart"/>
-      <w:r>
-        <w:rPr>
-          <w:lang w:val="de-DE"/>
-        </w:rPr>
-        <w:t>blue</w:t>
-      </w:r>
-      <w:proofErr w:type="spellEnd"/>
-      <w:r>
-        <w:rPr>
-          <w:lang w:val="de-DE"/>
-        </w:rPr>
-        <w:t xml:space="preserve">, </w:t>
-      </w:r>
-      <w:proofErr w:type="spellStart"/>
-      <w:r>
-        <w:rPr>
-          <w:lang w:val="de-DE"/>
-        </w:rPr>
-        <w:t>yellow</w:t>
-      </w:r>
-      <w:proofErr w:type="spellEnd"/>
-      <w:r>
-        <w:rPr>
-          <w:lang w:val="de-DE"/>
-        </w:rPr>
-        <w:t xml:space="preserve">, </w:t>
-      </w:r>
-      <w:proofErr w:type="spellStart"/>
-      <w:r>
-        <w:rPr>
-          <w:lang w:val="de-DE"/>
-        </w:rPr>
-        <w:t>violet</w:t>
-      </w:r>
-      <w:proofErr w:type="spellEnd"/>
+        <w:t>Was ist Docsstring</w:t>
+      </w:r>
+      <w:r>
+        <w:rPr>
+          <w:lang w:val="de-DE"/>
+        </w:rPr>
+        <w:t xml:space="preserve"> Dokumentation</w:t>
+      </w:r>
+      <w:r>
+        <w:rPr>
+          <w:lang w:val="de-DE"/>
+        </w:rPr>
+        <w:t>, wird dies nächste Woche angeschaut?</w:t>
+      </w:r>
     </w:p>
     <w:p>
       <w:pPr>
@@ -526,7 +621,7 @@
         <w:rPr>
           <w:lang w:val="de-DE"/>
         </w:rPr>
-        <w:t>Reicht</w:t>
+        <w:t>Kommt nächstens noch</w:t>
       </w:r>
     </w:p>
     <w:p>
@@ -544,133 +639,7 @@
         <w:rPr>
           <w:lang w:val="de-DE"/>
         </w:rPr>
-        <w:t xml:space="preserve">Gutes Tool / zur Dokumentation von </w:t>
-      </w:r>
-      <w:proofErr w:type="spellStart"/>
-      <w:r>
-        <w:rPr>
-          <w:lang w:val="de-DE"/>
-        </w:rPr>
-        <w:t>static</w:t>
-      </w:r>
-      <w:proofErr w:type="spellEnd"/>
-      <w:r>
-        <w:rPr>
-          <w:lang w:val="de-DE"/>
-        </w:rPr>
-        <w:t xml:space="preserve"> und </w:t>
-      </w:r>
-      <w:proofErr w:type="spellStart"/>
-      <w:r>
-        <w:rPr>
-          <w:lang w:val="de-DE"/>
-        </w:rPr>
-        <w:t>runtime</w:t>
-      </w:r>
-      <w:proofErr w:type="spellEnd"/>
-      <w:r>
-        <w:rPr>
-          <w:lang w:val="de-DE"/>
-        </w:rPr>
-        <w:t xml:space="preserve"> </w:t>
-      </w:r>
-      <w:proofErr w:type="spellStart"/>
-      <w:r>
-        <w:rPr>
-          <w:lang w:val="de-DE"/>
-        </w:rPr>
-        <w:t>view</w:t>
-      </w:r>
-      <w:proofErr w:type="spellEnd"/>
-      <w:r>
-        <w:rPr>
-          <w:lang w:val="de-DE"/>
-        </w:rPr>
-        <w:t xml:space="preserve"> </w:t>
-      </w:r>
-      <w:proofErr w:type="spellStart"/>
-      <w:r>
-        <w:rPr>
-          <w:lang w:val="de-DE"/>
-        </w:rPr>
-        <w:t>Diagrams</w:t>
-      </w:r>
-      <w:proofErr w:type="spellEnd"/>
-      <w:r>
-        <w:rPr>
-          <w:lang w:val="de-DE"/>
-        </w:rPr>
-        <w:t xml:space="preserve">, vor allem für UML </w:t>
-      </w:r>
-      <w:proofErr w:type="spellStart"/>
-      <w:r>
-        <w:rPr>
-          <w:lang w:val="de-DE"/>
-        </w:rPr>
-        <w:t>class</w:t>
-      </w:r>
-      <w:proofErr w:type="spellEnd"/>
-      <w:r>
-        <w:rPr>
-          <w:lang w:val="de-DE"/>
-        </w:rPr>
-        <w:t xml:space="preserve"> Diagramms, </w:t>
-      </w:r>
-      <w:proofErr w:type="spellStart"/>
-      <w:r>
-        <w:rPr>
-          <w:lang w:val="de-DE"/>
-        </w:rPr>
-        <w:t>runtime</w:t>
-      </w:r>
-      <w:proofErr w:type="spellEnd"/>
-      <w:r>
-        <w:rPr>
-          <w:lang w:val="de-DE"/>
-        </w:rPr>
-        <w:t xml:space="preserve"> </w:t>
-      </w:r>
-      <w:proofErr w:type="spellStart"/>
-      <w:r>
-        <w:rPr>
-          <w:lang w:val="de-DE"/>
-        </w:rPr>
-        <w:t>view</w:t>
-      </w:r>
-      <w:proofErr w:type="spellEnd"/>
-      <w:r>
-        <w:rPr>
-          <w:lang w:val="de-DE"/>
-        </w:rPr>
-        <w:t xml:space="preserve"> </w:t>
-      </w:r>
-      <w:proofErr w:type="spellStart"/>
-      <w:r>
-        <w:rPr>
-          <w:lang w:val="de-DE"/>
-        </w:rPr>
-        <w:t>Diagrams</w:t>
-      </w:r>
-      <w:proofErr w:type="spellEnd"/>
-      <w:r>
-        <w:rPr>
-          <w:lang w:val="de-DE"/>
-        </w:rPr>
-        <w:t xml:space="preserve"> = </w:t>
-      </w:r>
-      <w:proofErr w:type="spellStart"/>
-      <w:r>
-        <w:rPr>
-          <w:lang w:val="de-DE"/>
-        </w:rPr>
-        <w:t>Flussidagram</w:t>
-      </w:r>
-      <w:proofErr w:type="spellEnd"/>
-      <w:r>
-        <w:rPr>
-          <w:lang w:val="de-DE"/>
-        </w:rPr>
-        <w:t>?</w:t>
+        <w:t>Soll die Dokumentation im Read me gemacht sein</w:t>
       </w:r>
     </w:p>
     <w:p>
@@ -688,575 +657,8 @@
         <w:rPr>
           <w:lang w:val="de-DE"/>
         </w:rPr>
-        <w:t>UML Class Diagramms</w:t>
-      </w:r>
-      <w:r>
-        <w:rPr>
-          <w:lang w:val="de-DE"/>
-        </w:rPr>
-        <w:t xml:space="preserve"> Editor: </w:t>
-      </w:r>
-    </w:p>
-    <w:p>
-      <w:pPr>
-        <w:pStyle w:val="ListParagraph"/>
-        <w:numPr>
-          <w:ilvl w:val="1"/>
-          <w:numId w:val="1"/>
-        </w:numPr>
-        <w:rPr>
-          <w:lang w:val="de-DE"/>
-        </w:rPr>
-      </w:pPr>
-      <w:r>
-        <w:rPr>
-          <w:lang w:val="de-DE"/>
-        </w:rPr>
-        <w:t xml:space="preserve">Kommt nächste Woche, </w:t>
-      </w:r>
-      <w:proofErr w:type="spellStart"/>
-      <w:r>
-        <w:rPr>
-          <w:lang w:val="de-DE"/>
-        </w:rPr>
-        <w:t>Mermaid</w:t>
-      </w:r>
-      <w:proofErr w:type="spellEnd"/>
-      <w:r>
-        <w:rPr>
-          <w:lang w:val="de-DE"/>
-        </w:rPr>
-        <w:t xml:space="preserve"> als Editor</w:t>
-      </w:r>
-    </w:p>
-    <w:p>
-      <w:pPr>
-        <w:pStyle w:val="ListParagraph"/>
-        <w:numPr>
-          <w:ilvl w:val="0"/>
-          <w:numId w:val="1"/>
-        </w:numPr>
-        <w:rPr>
-          <w:lang w:val="de-DE"/>
-        </w:rPr>
-      </w:pPr>
-      <w:r>
-        <w:rPr>
-          <w:lang w:val="de-DE"/>
-        </w:rPr>
-        <w:t>Eher Funktionen oder direkt Klassen verwenden?</w:t>
-      </w:r>
-    </w:p>
-    <w:p>
-      <w:pPr>
-        <w:pStyle w:val="ListParagraph"/>
-        <w:numPr>
-          <w:ilvl w:val="1"/>
-          <w:numId w:val="1"/>
-        </w:numPr>
-        <w:rPr>
-          <w:lang w:val="de-DE"/>
-        </w:rPr>
-      </w:pPr>
-      <w:r>
-        <w:rPr>
-          <w:lang w:val="de-DE"/>
-        </w:rPr>
-        <w:t xml:space="preserve">Klassen verwenden, Kamera Komponente, </w:t>
-      </w:r>
-    </w:p>
-    <w:p>
-      <w:pPr>
-        <w:pStyle w:val="ListParagraph"/>
-        <w:numPr>
-          <w:ilvl w:val="0"/>
-          <w:numId w:val="1"/>
-        </w:numPr>
-        <w:rPr>
-          <w:lang w:val="de-DE"/>
-        </w:rPr>
-      </w:pPr>
-      <w:r>
-        <w:rPr>
-          <w:lang w:val="de-DE"/>
-        </w:rPr>
-        <w:t xml:space="preserve">Reicht es für die Beiden </w:t>
-      </w:r>
-      <w:proofErr w:type="spellStart"/>
-      <w:r>
-        <w:rPr>
-          <w:lang w:val="de-DE"/>
-        </w:rPr>
-        <w:t>operationsmodis</w:t>
-      </w:r>
-      <w:proofErr w:type="spellEnd"/>
-      <w:r>
-        <w:rPr>
-          <w:lang w:val="de-DE"/>
-        </w:rPr>
-        <w:t xml:space="preserve">, das diese über die </w:t>
-      </w:r>
-      <w:proofErr w:type="spellStart"/>
-      <w:r>
-        <w:rPr>
-          <w:lang w:val="de-DE"/>
-        </w:rPr>
-        <w:t>Komando</w:t>
-      </w:r>
-      <w:proofErr w:type="spellEnd"/>
-      <w:r>
-        <w:rPr>
-          <w:lang w:val="de-DE"/>
-        </w:rPr>
-        <w:t xml:space="preserve"> Zeile ausgewählt werden können?</w:t>
-      </w:r>
-    </w:p>
-    <w:p>
-      <w:pPr>
-        <w:pStyle w:val="ListParagraph"/>
-        <w:numPr>
-          <w:ilvl w:val="1"/>
-          <w:numId w:val="1"/>
-        </w:numPr>
-        <w:rPr>
-          <w:lang w:val="de-DE"/>
-        </w:rPr>
-      </w:pPr>
-      <w:r>
-        <w:rPr>
-          <w:lang w:val="de-DE"/>
-        </w:rPr>
-        <w:t>Solange das Dokumentier ist. Sauber dokumentieren wie starten</w:t>
-      </w:r>
-    </w:p>
-    <w:p>
-      <w:pPr>
-        <w:pStyle w:val="ListParagraph"/>
-        <w:numPr>
-          <w:ilvl w:val="0"/>
-          <w:numId w:val="1"/>
-        </w:numPr>
-        <w:rPr>
-          <w:lang w:val="de-DE"/>
-        </w:rPr>
-      </w:pPr>
-      <w:r>
-        <w:rPr>
-          <w:lang w:val="de-DE"/>
-        </w:rPr>
-        <w:t xml:space="preserve">Pfad </w:t>
-      </w:r>
-      <w:proofErr w:type="gramStart"/>
-      <w:r>
-        <w:rPr>
-          <w:lang w:val="de-DE"/>
-        </w:rPr>
-        <w:t>zu Bilder</w:t>
-      </w:r>
-      <w:proofErr w:type="gramEnd"/>
-      <w:r>
-        <w:rPr>
-          <w:lang w:val="de-DE"/>
-        </w:rPr>
-        <w:t xml:space="preserve"> für IMAGE Mode auch im </w:t>
-      </w:r>
-      <w:proofErr w:type="spellStart"/>
-      <w:r>
-        <w:rPr>
-          <w:lang w:val="de-DE"/>
-        </w:rPr>
-        <w:t>config</w:t>
-      </w:r>
-      <w:proofErr w:type="spellEnd"/>
-      <w:r>
-        <w:rPr>
-          <w:lang w:val="de-DE"/>
-        </w:rPr>
-        <w:t xml:space="preserve"> </w:t>
-      </w:r>
-      <w:proofErr w:type="spellStart"/>
-      <w:r>
-        <w:rPr>
-          <w:lang w:val="de-DE"/>
-        </w:rPr>
-        <w:t>file</w:t>
-      </w:r>
-      <w:proofErr w:type="spellEnd"/>
-      <w:r>
-        <w:rPr>
-          <w:lang w:val="de-DE"/>
-        </w:rPr>
-        <w:t xml:space="preserve"> speichern?</w:t>
-      </w:r>
-    </w:p>
-    <w:p>
-      <w:pPr>
-        <w:pStyle w:val="ListParagraph"/>
-        <w:numPr>
-          <w:ilvl w:val="1"/>
-          <w:numId w:val="1"/>
-        </w:numPr>
-        <w:rPr>
-          <w:lang w:val="de-DE"/>
-        </w:rPr>
-      </w:pPr>
-      <w:r>
-        <w:rPr>
-          <w:lang w:val="de-DE"/>
-        </w:rPr>
-        <w:t xml:space="preserve">Ins </w:t>
-      </w:r>
-      <w:proofErr w:type="spellStart"/>
-      <w:r>
-        <w:rPr>
-          <w:lang w:val="de-DE"/>
-        </w:rPr>
-        <w:t>Config</w:t>
-      </w:r>
-      <w:proofErr w:type="spellEnd"/>
-      <w:r>
-        <w:rPr>
-          <w:lang w:val="de-DE"/>
-        </w:rPr>
-        <w:t xml:space="preserve"> File schreiben</w:t>
-      </w:r>
-    </w:p>
-    <w:p>
-      <w:pPr>
-        <w:pStyle w:val="ListParagraph"/>
-        <w:numPr>
-          <w:ilvl w:val="0"/>
-          <w:numId w:val="1"/>
-        </w:numPr>
-        <w:rPr>
-          <w:lang w:val="de-DE"/>
-        </w:rPr>
-      </w:pPr>
-      <w:r>
-        <w:rPr>
-          <w:lang w:val="de-DE"/>
-        </w:rPr>
-        <w:t>Flowcharts in md Readme wird noch ge</w:t>
-      </w:r>
-      <w:r>
-        <w:rPr>
-          <w:lang w:val="de-DE"/>
-        </w:rPr>
-        <w:t>zeigt?</w:t>
-      </w:r>
-    </w:p>
-    <w:p>
-      <w:pPr>
-        <w:pStyle w:val="ListParagraph"/>
-        <w:numPr>
-          <w:ilvl w:val="1"/>
-          <w:numId w:val="1"/>
-        </w:numPr>
-        <w:rPr>
-          <w:lang w:val="de-DE"/>
-        </w:rPr>
-      </w:pPr>
-      <w:r>
-        <w:rPr>
-          <w:lang w:val="de-DE"/>
-        </w:rPr>
-        <w:t>Wird noch gezeigt</w:t>
-      </w:r>
-    </w:p>
-    <w:p>
-      <w:pPr>
-        <w:pStyle w:val="ListParagraph"/>
-        <w:numPr>
-          <w:ilvl w:val="0"/>
-          <w:numId w:val="1"/>
-        </w:numPr>
-        <w:rPr>
-          <w:lang w:val="de-DE"/>
-        </w:rPr>
-      </w:pPr>
-      <w:r>
-        <w:rPr>
-          <w:lang w:val="de-DE"/>
-        </w:rPr>
-        <w:t>Was sollte das GUI beinhalten?</w:t>
-      </w:r>
-      <w:r>
-        <w:rPr>
-          <w:lang w:val="de-DE"/>
-        </w:rPr>
-        <w:br/>
-        <w:t xml:space="preserve">Button zum Wechseln der </w:t>
-      </w:r>
-      <w:proofErr w:type="spellStart"/>
-      <w:r>
-        <w:rPr>
-          <w:lang w:val="de-DE"/>
-        </w:rPr>
-        <w:t>operation</w:t>
-      </w:r>
-      <w:proofErr w:type="spellEnd"/>
-      <w:r>
-        <w:rPr>
-          <w:lang w:val="de-DE"/>
-        </w:rPr>
-        <w:t xml:space="preserve"> Modis?</w:t>
-      </w:r>
-    </w:p>
-    <w:p>
-      <w:pPr>
-        <w:pStyle w:val="ListParagraph"/>
-        <w:numPr>
-          <w:ilvl w:val="1"/>
-          <w:numId w:val="1"/>
-        </w:numPr>
-        <w:rPr>
-          <w:lang w:val="de-DE"/>
-        </w:rPr>
-      </w:pPr>
-      <w:proofErr w:type="spellStart"/>
-      <w:r>
-        <w:rPr>
-          <w:lang w:val="de-DE"/>
-        </w:rPr>
-        <w:t>Fliessband</w:t>
-      </w:r>
-      <w:proofErr w:type="spellEnd"/>
-      <w:r>
-        <w:rPr>
-          <w:lang w:val="de-DE"/>
-        </w:rPr>
-        <w:t xml:space="preserve"> </w:t>
-      </w:r>
-      <w:proofErr w:type="spellStart"/>
-      <w:r>
-        <w:rPr>
-          <w:lang w:val="de-DE"/>
-        </w:rPr>
-        <w:t>anlage</w:t>
-      </w:r>
-      <w:proofErr w:type="spellEnd"/>
-      <w:r>
-        <w:rPr>
-          <w:lang w:val="de-DE"/>
-        </w:rPr>
-        <w:t xml:space="preserve"> als Beispiel </w:t>
-      </w:r>
-      <w:proofErr w:type="spellStart"/>
-      <w:r>
-        <w:rPr>
-          <w:lang w:val="de-DE"/>
-        </w:rPr>
-        <w:t>detection</w:t>
-      </w:r>
-      <w:proofErr w:type="spellEnd"/>
-      <w:r>
-        <w:rPr>
-          <w:lang w:val="de-DE"/>
-        </w:rPr>
-        <w:t xml:space="preserve"> und speichern anzeigen</w:t>
-      </w:r>
-    </w:p>
-    <w:p>
-      <w:pPr>
-        <w:pStyle w:val="ListParagraph"/>
-        <w:numPr>
-          <w:ilvl w:val="0"/>
-          <w:numId w:val="1"/>
-        </w:numPr>
-        <w:rPr>
-          <w:lang w:val="de-DE"/>
-        </w:rPr>
-      </w:pPr>
-      <w:r>
-        <w:rPr>
-          <w:lang w:val="de-DE"/>
-        </w:rPr>
-        <w:t xml:space="preserve">FEAT ist einfach eine </w:t>
-      </w:r>
-      <w:proofErr w:type="gramStart"/>
-      <w:r>
-        <w:rPr>
-          <w:lang w:val="de-DE"/>
-        </w:rPr>
-        <w:t>stimme</w:t>
-      </w:r>
-      <w:proofErr w:type="gramEnd"/>
-      <w:r>
-        <w:rPr>
-          <w:lang w:val="de-DE"/>
-        </w:rPr>
-        <w:t xml:space="preserve"> welche sagt, Dreieck Rot, Viereck Gelb, usw. </w:t>
-      </w:r>
-    </w:p>
-    <w:p>
-      <w:pPr>
-        <w:pStyle w:val="ListParagraph"/>
-        <w:numPr>
-          <w:ilvl w:val="1"/>
-          <w:numId w:val="1"/>
-        </w:numPr>
-        <w:rPr>
-          <w:lang w:val="de-DE"/>
-        </w:rPr>
-      </w:pPr>
-    </w:p>
-    <w:p>
-      <w:pPr>
-        <w:pStyle w:val="ListParagraph"/>
-        <w:numPr>
-          <w:ilvl w:val="0"/>
-          <w:numId w:val="1"/>
-        </w:numPr>
-        <w:rPr>
-          <w:lang w:val="de-DE"/>
-        </w:rPr>
-      </w:pPr>
-      <w:r>
-        <w:rPr>
-          <w:lang w:val="de-DE"/>
-        </w:rPr>
-        <w:t>Muss FEAT in Dauerschleife laufen oder kann man auf ein Pattern drücken und es gibt dessen Properties aus?</w:t>
-      </w:r>
-    </w:p>
-    <w:p>
-      <w:pPr>
-        <w:pStyle w:val="ListParagraph"/>
-        <w:numPr>
-          <w:ilvl w:val="1"/>
-          <w:numId w:val="1"/>
-        </w:numPr>
-        <w:rPr>
-          <w:lang w:val="de-DE"/>
-        </w:rPr>
-      </w:pPr>
-      <w:r>
-        <w:rPr>
-          <w:lang w:val="de-DE"/>
-        </w:rPr>
-        <w:t xml:space="preserve">Logs und </w:t>
-      </w:r>
-      <w:proofErr w:type="spellStart"/>
-      <w:r>
-        <w:rPr>
-          <w:lang w:val="de-DE"/>
-        </w:rPr>
-        <w:t>Autdio</w:t>
-      </w:r>
-      <w:proofErr w:type="spellEnd"/>
-      <w:r>
-        <w:rPr>
-          <w:lang w:val="de-DE"/>
-        </w:rPr>
-        <w:t xml:space="preserve"> </w:t>
-      </w:r>
-      <w:proofErr w:type="spellStart"/>
-      <w:r>
-        <w:rPr>
-          <w:lang w:val="de-DE"/>
-        </w:rPr>
-        <w:t>output</w:t>
-      </w:r>
-      <w:proofErr w:type="spellEnd"/>
-      <w:r>
-        <w:rPr>
-          <w:lang w:val="de-DE"/>
-        </w:rPr>
-        <w:t xml:space="preserve"> nur 1x Pro Pattern </w:t>
-      </w:r>
-    </w:p>
-    <w:p>
-      <w:pPr>
-        <w:pStyle w:val="ListParagraph"/>
-        <w:numPr>
-          <w:ilvl w:val="0"/>
-          <w:numId w:val="1"/>
-        </w:numPr>
-        <w:rPr>
-          <w:lang w:val="de-DE"/>
-        </w:rPr>
-      </w:pPr>
-      <w:r>
-        <w:rPr>
-          <w:lang w:val="de-DE"/>
-        </w:rPr>
-        <w:t xml:space="preserve">Was ist </w:t>
-      </w:r>
-      <w:proofErr w:type="spellStart"/>
-      <w:r>
-        <w:rPr>
-          <w:lang w:val="de-DE"/>
-        </w:rPr>
-        <w:t>Docsstring</w:t>
-      </w:r>
-      <w:proofErr w:type="spellEnd"/>
-      <w:r>
-        <w:rPr>
-          <w:lang w:val="de-DE"/>
-        </w:rPr>
-        <w:t xml:space="preserve"> Dokumentation</w:t>
-      </w:r>
-      <w:r>
-        <w:rPr>
-          <w:lang w:val="de-DE"/>
-        </w:rPr>
-        <w:t>, wird dies nächste Woche angeschaut?</w:t>
-      </w:r>
-    </w:p>
-    <w:p>
-      <w:pPr>
-        <w:pStyle w:val="ListParagraph"/>
-        <w:numPr>
-          <w:ilvl w:val="1"/>
-          <w:numId w:val="1"/>
-        </w:numPr>
-        <w:rPr>
-          <w:lang w:val="de-DE"/>
-        </w:rPr>
-      </w:pPr>
-    </w:p>
-    <w:p>
-      <w:pPr>
-        <w:pStyle w:val="ListParagraph"/>
-        <w:numPr>
-          <w:ilvl w:val="0"/>
-          <w:numId w:val="1"/>
-        </w:numPr>
-        <w:rPr>
-          <w:lang w:val="de-DE"/>
-        </w:rPr>
-      </w:pPr>
-      <w:r>
-        <w:rPr>
-          <w:lang w:val="de-DE"/>
-        </w:rPr>
-        <w:t xml:space="preserve">Soll die Dokumentation im Read </w:t>
-      </w:r>
-      <w:proofErr w:type="spellStart"/>
-      <w:r>
-        <w:rPr>
-          <w:lang w:val="de-DE"/>
-        </w:rPr>
-        <w:t>me</w:t>
-      </w:r>
-      <w:proofErr w:type="spellEnd"/>
-      <w:r>
-        <w:rPr>
-          <w:lang w:val="de-DE"/>
-        </w:rPr>
-        <w:t xml:space="preserve"> gemacht sein</w:t>
-      </w:r>
-    </w:p>
-    <w:p>
-      <w:pPr>
-        <w:pStyle w:val="ListParagraph"/>
-        <w:numPr>
-          <w:ilvl w:val="1"/>
-          <w:numId w:val="1"/>
-        </w:numPr>
-        <w:rPr>
-          <w:lang w:val="de-DE"/>
-        </w:rPr>
-      </w:pPr>
+        <w:t>Selber schauen</w:t>
+      </w:r>
     </w:p>
     <w:sectPr>
       <w:pgSz w:w="11906" w:h="16838"/>

</xml_diff>